<commit_message>
Pantallas: ninguna restricción en Lógica General; mensajes de éxito, fallos, historial y asistente
Co-Authored-By: Claude Opus 5.5 <noreply@anthropic.com>
</commit_message>
<xml_diff>
--- a/skills/appian-functional-analyst/assets/plantillas/df-cliente.docx
+++ b/skills/appian-functional-analyst/assets/plantillas/df-cliente.docx
@@ -4130,18 +4130,10 @@
         <w:t>[valores o formato de visualización]</w:t>
       </w:r>
       <w:r>
-        <w:t>. Valor por defecto: "</w:t>
-      </w:r>
-      <w:r>
-        <w:rPr>
-          <w:i/>
-          <w:iCs/>
-          <w:color w:val="8A9096"/>
-        </w:rPr>
-        <w:t>[valor]</w:t>
-      </w:r>
-      <w:r>
-        <w:t>". Si el campo no tiene valor, se muestra un guion ("-").</w:t>
+        <w:t xml:space="preserve">. </w:t>
+      </w:r>
+      <w:r>
+        <w:t>Si el campo no tiene valor, se muestra un guion ("-").</w:t>
       </w:r>
     </w:p>
     <w:p>
@@ -4230,57 +4222,12 @@
         <w:t>[origen]</w:t>
       </w:r>
       <w:r>
-        <w:t xml:space="preserve">. </w:t>
-      </w:r>
-      <w:r>
-        <w:rPr>
-          <w:lang w:val="en-US"/>
-        </w:rPr>
-        <w:t xml:space="preserve">Valor </w:t>
+        <w:t>.</w:t>
       </w:r>
       <w:proofErr w:type="spellStart"/>
-      <w:r>
-        <w:rPr>
-          <w:lang w:val="en-US"/>
-        </w:rPr>
-        <w:t>por</w:t>
-      </w:r>
       <w:proofErr w:type="spellEnd"/>
-      <w:r>
-        <w:rPr>
-          <w:lang w:val="en-US"/>
-        </w:rPr>
-        <w:t xml:space="preserve"> </w:t>
-      </w:r>
       <w:proofErr w:type="spellStart"/>
-      <w:r>
-        <w:rPr>
-          <w:lang w:val="en-US"/>
-        </w:rPr>
-        <w:t>defecto</w:t>
-      </w:r>
       <w:proofErr w:type="spellEnd"/>
-      <w:r>
-        <w:rPr>
-          <w:lang w:val="en-US"/>
-        </w:rPr>
-        <w:t>: "</w:t>
-      </w:r>
-      <w:r>
-        <w:rPr>
-          <w:i/>
-          <w:iCs/>
-          <w:color w:val="8A9096"/>
-          <w:lang w:val="en-US"/>
-        </w:rPr>
-        <w:t>[valor]</w:t>
-      </w:r>
-      <w:r>
-        <w:rPr>
-          <w:lang w:val="en-US"/>
-        </w:rPr>
-        <w:t>".</w:t>
-      </w:r>
     </w:p>
     <w:p>
       <w:pPr>
@@ -6261,18 +6208,10 @@
         <w:t>[valores o formato de visualización]</w:t>
       </w:r>
       <w:r>
-        <w:t>. Valor por defecto: "</w:t>
-      </w:r>
-      <w:r>
-        <w:rPr>
-          <w:i/>
-          <w:iCs/>
-          <w:color w:val="8A9096"/>
-        </w:rPr>
-        <w:t>[valor]</w:t>
-      </w:r>
-      <w:r>
-        <w:t>". Si el campo no tiene valor, se muestra un guion ("-").</w:t>
+        <w:t xml:space="preserve">. </w:t>
+      </w:r>
+      <w:r>
+        <w:t>Si el campo no tiene valor, se muestra un guion ("-").</w:t>
       </w:r>
     </w:p>
     <w:p>
@@ -6360,57 +6299,12 @@
         <w:t>[origen]</w:t>
       </w:r>
       <w:r>
-        <w:t xml:space="preserve">. </w:t>
-      </w:r>
-      <w:r>
-        <w:rPr>
-          <w:lang w:val="en-US"/>
-        </w:rPr>
-        <w:t xml:space="preserve">Valor </w:t>
+        <w:t>.</w:t>
       </w:r>
       <w:proofErr w:type="spellStart"/>
-      <w:r>
-        <w:rPr>
-          <w:lang w:val="en-US"/>
-        </w:rPr>
-        <w:t>por</w:t>
-      </w:r>
       <w:proofErr w:type="spellEnd"/>
-      <w:r>
-        <w:rPr>
-          <w:lang w:val="en-US"/>
-        </w:rPr>
-        <w:t xml:space="preserve"> </w:t>
-      </w:r>
       <w:proofErr w:type="spellStart"/>
-      <w:r>
-        <w:rPr>
-          <w:lang w:val="en-US"/>
-        </w:rPr>
-        <w:t>defecto</w:t>
-      </w:r>
       <w:proofErr w:type="spellEnd"/>
-      <w:r>
-        <w:rPr>
-          <w:lang w:val="en-US"/>
-        </w:rPr>
-        <w:t>: "</w:t>
-      </w:r>
-      <w:r>
-        <w:rPr>
-          <w:i/>
-          <w:iCs/>
-          <w:color w:val="8A9096"/>
-          <w:lang w:val="en-US"/>
-        </w:rPr>
-        <w:t>[valor]</w:t>
-      </w:r>
-      <w:r>
-        <w:rPr>
-          <w:lang w:val="en-US"/>
-        </w:rPr>
-        <w:t>".</w:t>
-      </w:r>
     </w:p>
     <w:p>
       <w:pPr>
@@ -8401,18 +8295,10 @@
         <w:t>[valores o formato de visualización]</w:t>
       </w:r>
       <w:r>
-        <w:t>. Valor por defecto: "</w:t>
-      </w:r>
-      <w:r>
-        <w:rPr>
-          <w:i/>
-          <w:iCs/>
-          <w:color w:val="8A9096"/>
-        </w:rPr>
-        <w:t>[valor]</w:t>
-      </w:r>
-      <w:r>
-        <w:t>". Si el campo no tiene valor, se muestra un guion ("-").</w:t>
+        <w:t xml:space="preserve">. </w:t>
+      </w:r>
+      <w:r>
+        <w:t>Si el campo no tiene valor, se muestra un guion ("-").</w:t>
       </w:r>
     </w:p>
     <w:p>
@@ -8500,57 +8386,12 @@
         <w:t>[origen]</w:t>
       </w:r>
       <w:r>
-        <w:t xml:space="preserve">. </w:t>
-      </w:r>
-      <w:r>
-        <w:rPr>
-          <w:lang w:val="en-US"/>
-        </w:rPr>
-        <w:t xml:space="preserve">Valor </w:t>
+        <w:t>.</w:t>
       </w:r>
       <w:proofErr w:type="spellStart"/>
-      <w:r>
-        <w:rPr>
-          <w:lang w:val="en-US"/>
-        </w:rPr>
-        <w:t>por</w:t>
-      </w:r>
       <w:proofErr w:type="spellEnd"/>
-      <w:r>
-        <w:rPr>
-          <w:lang w:val="en-US"/>
-        </w:rPr>
-        <w:t xml:space="preserve"> </w:t>
-      </w:r>
       <w:proofErr w:type="spellStart"/>
-      <w:r>
-        <w:rPr>
-          <w:lang w:val="en-US"/>
-        </w:rPr>
-        <w:t>defecto</w:t>
-      </w:r>
       <w:proofErr w:type="spellEnd"/>
-      <w:r>
-        <w:rPr>
-          <w:lang w:val="en-US"/>
-        </w:rPr>
-        <w:t>: "</w:t>
-      </w:r>
-      <w:r>
-        <w:rPr>
-          <w:i/>
-          <w:iCs/>
-          <w:color w:val="8A9096"/>
-          <w:lang w:val="en-US"/>
-        </w:rPr>
-        <w:t>[valor]</w:t>
-      </w:r>
-      <w:r>
-        <w:rPr>
-          <w:lang w:val="en-US"/>
-        </w:rPr>
-        <w:t>".</w:t>
-      </w:r>
     </w:p>
     <w:p>
       <w:pPr>

</xml_diff>